<commit_message>
Dercy Parte 5: revisão
Co-Authored-By: Claude Opus 5.5 <noreply@anthropic.com>
Claude-Session: https://claude.ai/code/session_01MJjUEEZrxQDEUifKK2vj9g
</commit_message>
<xml_diff>
--- a/roteiros/dercy/Dercy_Parte5.docx
+++ b/roteiros/dercy/Dercy_Parte5.docx
@@ -79,7 +79,7 @@
         <w:rPr>
           <w:color w:val="C00000"/>
         </w:rPr>
-        <w:t>Pare e junte as duas histórias. Uma amiga diz que deitou o caixão sozinha, por pena, aproveitando um erro na vedação. A filha diz que a família decidiu deitar a mãe por causa da pressão de moradores da cidade. As duas versões não combinam. E é justamente nesse buraco entre elas que está a parte mais cruel desta história.</w:t>
+        <w:t>Pare e junte as duas histórias. Uma amiga diz que mandou deitar o caixão, por pena, aproveitando um erro na vedação. A filha diz que a família decidiu deitar a mãe por causa da pressão de moradores da cidade. As duas versões não combinam. E é justamente nesse buraco entre elas que está a parte mais cruel desta história.</w:t>
       </w:r>
     </w:p>
     <w:p>
@@ -111,7 +111,7 @@
         <w:rPr>
           <w:color w:val="000000"/>
         </w:rPr>
-        <w:t>Ninguém respeitou o pedido de Dercy Gonçalves.</w:t>
+        <w:t>Ninguém respeitou o pedido de Dercy Gonçalves até o fim.</w:t>
       </w:r>
     </w:p>
     <w:p>
@@ -159,7 +159,7 @@
         <w:rPr>
           <w:color w:val="C00000"/>
         </w:rPr>
-        <w:t>E o que aconteceu com a família de Dercy depois disso deixa a pirâmide de vidro ainda mais solitária. Porque a pessoa que ficou com tudo o que Dercy deixou fez uma escolha que pouca gente notou.</w:t>
+        <w:t>E o que aconteceu com a família de Dercy depois disso deixa a pirâmide de vidro ainda mais solitária. Porque o destino da pessoa que ficou com tudo o que Dercy deixou foi o oposto do que a mãe escolheu para si.</w:t>
       </w:r>
     </w:p>
     <w:p>
@@ -247,7 +247,7 @@
         <w:rPr>
           <w:color w:val="000000"/>
         </w:rPr>
-        <w:t>Decimar não foi levada para Santa Maria Madalena, para ficar ao lado da mãe debaixo daquela pirâmide de vidro.</w:t>
+        <w:t>A mãe tinha construído uma pirâmide de vidro para esperar por ela durante dezessete anos. A filha virou cinzas, a duzentos quilômetros dali.</w:t>
       </w:r>
     </w:p>
     <w:p>
@@ -255,7 +255,7 @@
         <w:rPr>
           <w:color w:val="000000"/>
         </w:rPr>
-        <w:t>Dercy continuou lá sozinha.</w:t>
+        <w:t>Lá na serra, o caixão de Dercy continuou no mesmo lugar.</w:t>
       </w:r>
     </w:p>
     <w:p>
@@ -279,7 +279,7 @@
         <w:rPr>
           <w:color w:val="000000"/>
         </w:rPr>
-        <w:t>Virou ponto turístico. Gente de fora tira foto, aponta, comenta.</w:t>
+        <w:t>Virou ponto turístico. Gente de fora para diante dela para tirar foto.</w:t>
       </w:r>
     </w:p>
     <w:p>
@@ -311,7 +311,7 @@
         <w:rPr>
           <w:color w:val="000000"/>
         </w:rPr>
-        <w:t>Deitado desde o dia seguinte ao enterro, por uma decisão que ela não tomou e que ninguém consegue explicar com uma única versão.</w:t>
+        <w:t>Deitado desde logo depois do enterro, por uma decisão que ela não tomou e que ninguém consegue explicar com uma única versão.</w:t>
       </w:r>
     </w:p>
     <w:p>
@@ -327,7 +327,7 @@
         <w:rPr>
           <w:color w:val="000000"/>
         </w:rPr>
-        <w:t>A filha que um dia decidiu deitar aquele caixão também já se foi.</w:t>
+        <w:t>A filha que, segundo ela mesma, decidiu deitar aquele caixão também já se foi.</w:t>
       </w:r>
     </w:p>
     <w:p>

</xml_diff>